<commit_message>
fix: update creed council wording
</commit_message>
<xml_diff>
--- a/src/assets/creed/Emmanuel_Creed.docx
+++ b/src/assets/creed/Emmanuel_Creed.docx
@@ -152,7 +152,7 @@
     </w:p>
     <w:p>
       <w:r>
-        <w:t>We believe that the sixty-six books of Holy Scripture are inspired by the Holy Spirit and are the supreme, sufficient, and trustworthy authority for Christian faith and life. Jesus Christ is the center and fulfillment of Scripture. We agree with most of the results of the first four ecumenical councils.</w:t>
+        <w:t>We believe that the sixty-six books of Holy Scripture are inspired by the Holy Spirit and are the supreme, sufficient, and trustworthy authority for Christian faith and life. Jesus Christ is the center and fulfillment of Scripture. We agree with the decisions of the first four ecumenical councils.</w:t>
       </w:r>
     </w:p>
     <w:p>
@@ -517,7 +517,7 @@
         <w:rPr>
           <w:lang w:val="uk-UA"/>
         </w:rPr>
-        <w:t xml:space="preserve"> та є найвищим, достатнім і достовірним авторитетом для християнської віри та життя. Ісус Христос є центром і виконанням Писання. Ми погоджуємося з більшістю рішень перших чотирьох Вселенських Соборів.</w:t>
+        <w:t xml:space="preserve"> та є найвищим, достатнім і достовірним авторитетом для християнської віри та життя. Ісус Христос є центром і виконанням Писання. Ми погоджуємося з рішенями перших чотирьох Вселенських Соборів.</w:t>
       </w:r>
     </w:p>
     <w:p>
@@ -933,7 +933,7 @@
         <w:rPr>
           <w:lang w:val="sk-SK"/>
         </w:rPr>
-        <w:t>Veríme, že šesťdesiatšesť kníh Svätého písma je inšpirovaných Duchom Svätým a je najvyššou, dostatočnou a spoľahlivou autoritou pre kresťanskú vieru a život. Ježiš Kristus je stredom a naplnením Písma. Súhlasíme s väčšinou rozhodnutí prvých štyroch ekumenických koncilov.</w:t>
+        <w:t>Veríme, že šesťdesiatšesť kníh Svätého písma je inšpirovaných Duchom Svätým a je najvyššou, dostatočnou a spoľahlivou autoritou pre kresťanskú vieru a život. Ježiš Kristus je stredom a naplnením Písma. Súhlasíme s rozhodnutiami prvých štyroch ekumenických koncilov.</w:t>
       </w:r>
     </w:p>
     <w:p>

</xml_diff>